<commit_message>
fix to activity 9.1
</commit_message>
<xml_diff>
--- a/docs/3-activities/instructions/09.1-activity-polls.docx
+++ b/docs/3-activities/instructions/09.1-activity-polls.docx
@@ -645,6 +645,7 @@
     </w:p>
     <w:p>
       <w:pPr>
+        <w:pStyle w:val="Compact"/>
         <w:numPr>
           <w:ilvl w:val="0"/>
           <w:numId w:val="1004"/>
@@ -656,41 +657,266 @@
     </w:p>
     <w:p>
       <w:pPr>
-        <w:numPr>
-          <w:ilvl w:val="0"/>
-          <w:numId w:val="1004"/>
-        </w:numPr>
-      </w:pPr>
-      <w:r>
-        <w:t xml:space="preserve">What do you notice about the % of people who claimed that they sent the straw vote ballot back?</w:t>
-      </w:r>
-    </w:p>
-    <w:bookmarkEnd w:id="26"/>
-    <w:bookmarkStart w:id="32" w:name="reflection"/>
-    <w:p>
-      <w:pPr>
-        <w:pStyle w:val="Heading2"/>
-      </w:pPr>
-      <w:r>
-        <w:t xml:space="preserve">Reflection</w:t>
-      </w:r>
-    </w:p>
-    <w:p>
-      <w:pPr>
+        <w:pStyle w:val="FirstParagraph"/>
+      </w:pPr>
+      <w:r>
+        <w:t xml:space="preserve">Here is a table version of the responses:</w:t>
+      </w:r>
+    </w:p>
+    <w:tbl>
+      <w:tblPr>
+        <w:tblStyle w:val="Table"/>
+        <w:tblW w:type="auto" w:w="0"/>
+        <w:tblLook w:firstRow="1" w:lastRow="0" w:firstColumn="0" w:lastColumn="0" w:noHBand="0" w:noVBand="0" w:val="0020"/>
+      </w:tblPr>
+      <w:tblGrid>
+        <w:gridCol w:w="1980"/>
+        <w:gridCol w:w="1980"/>
+        <w:gridCol w:w="1980"/>
+        <w:gridCol w:w="1980"/>
+      </w:tblGrid>
+      <w:tr>
+        <w:trPr>
+          <w:tblHeader w:val="on"/>
+        </w:trPr>
+        <w:tc>
+          <w:tcPr/>
+          <w:p>
+            <w:pPr>
+              <w:pStyle w:val="Compact"/>
+              <w:jc w:val="left"/>
+            </w:pPr>
+            <w:r>
+              <w:t xml:space="preserve">ballot</w:t>
+            </w:r>
+          </w:p>
+        </w:tc>
+        <w:tc>
+          <w:tcPr/>
+          <w:p>
+            <w:pPr>
+              <w:pStyle w:val="Compact"/>
+              <w:jc w:val="right"/>
+            </w:pPr>
+            <w:r>
+              <w:t xml:space="preserve">landon</w:t>
+            </w:r>
+          </w:p>
+        </w:tc>
+        <w:tc>
+          <w:tcPr/>
+          <w:p>
+            <w:pPr>
+              <w:pStyle w:val="Compact"/>
+              <w:jc w:val="right"/>
+            </w:pPr>
+            <w:r>
+              <w:t xml:space="preserve">roosevelt</w:t>
+            </w:r>
+          </w:p>
+        </w:tc>
+        <w:tc>
+          <w:tcPr/>
+          <w:p>
+            <w:pPr>
+              <w:pStyle w:val="Compact"/>
+              <w:jc w:val="right"/>
+            </w:pPr>
+            <w:r>
+              <w:t xml:space="preserve">n</w:t>
+            </w:r>
+          </w:p>
+        </w:tc>
+      </w:tr>
+      <w:tr>
+        <w:tc>
+          <w:tcPr/>
+          <w:p>
+            <w:pPr>
+              <w:pStyle w:val="Compact"/>
+              <w:jc w:val="left"/>
+            </w:pPr>
+            <w:r>
+              <w:t xml:space="preserve">returned</w:t>
+            </w:r>
+          </w:p>
+        </w:tc>
+        <w:tc>
+          <w:tcPr/>
+          <w:p>
+            <w:pPr>
+              <w:pStyle w:val="Compact"/>
+              <w:jc w:val="right"/>
+            </w:pPr>
+            <w:r>
+              <w:t xml:space="preserve">251</w:t>
+            </w:r>
+          </w:p>
+        </w:tc>
+        <w:tc>
+          <w:tcPr/>
+          <w:p>
+            <w:pPr>
+              <w:pStyle w:val="Compact"/>
+              <w:jc w:val="right"/>
+            </w:pPr>
+            <w:r>
+              <w:t xml:space="preserve">237</w:t>
+            </w:r>
+          </w:p>
+        </w:tc>
+        <w:tc>
+          <w:tcPr/>
+          <w:p>
+            <w:pPr>
+              <w:pStyle w:val="Compact"/>
+              <w:jc w:val="right"/>
+            </w:pPr>
+            <w:r>
+              <w:t xml:space="preserve">493</w:t>
+            </w:r>
+          </w:p>
+        </w:tc>
+      </w:tr>
+      <w:tr>
+        <w:tc>
+          <w:tcPr/>
+          <w:p>
+            <w:pPr>
+              <w:pStyle w:val="Compact"/>
+              <w:jc w:val="left"/>
+            </w:pPr>
+            <w:r>
+              <w:t xml:space="preserve">did not return</w:t>
+            </w:r>
+          </w:p>
+        </w:tc>
+        <w:tc>
+          <w:tcPr/>
+          <w:p>
+            <w:pPr>
+              <w:pStyle w:val="Compact"/>
+              <w:jc w:val="right"/>
+            </w:pPr>
+            <w:r>
+              <w:t xml:space="preserve">86</w:t>
+            </w:r>
+          </w:p>
+        </w:tc>
+        <w:tc>
+          <w:tcPr/>
+          <w:p>
+            <w:pPr>
+              <w:pStyle w:val="Compact"/>
+              <w:jc w:val="right"/>
+            </w:pPr>
+            <w:r>
+              <w:t xml:space="preserve">199</w:t>
+            </w:r>
+          </w:p>
+        </w:tc>
+        <w:tc>
+          <w:tcPr/>
+          <w:p>
+            <w:pPr>
+              <w:pStyle w:val="Compact"/>
+              <w:jc w:val="right"/>
+            </w:pPr>
+            <w:r>
+              <w:t xml:space="preserve">288</w:t>
+            </w:r>
+          </w:p>
+        </w:tc>
+      </w:tr>
+      <w:tr>
+        <w:tc>
+          <w:tcPr/>
+          <w:p>
+            <w:pPr>
+              <w:pStyle w:val="Compact"/>
+              <w:jc w:val="left"/>
+            </w:pPr>
+            <w:r>
+              <w:t xml:space="preserve">don’t know</w:t>
+            </w:r>
+          </w:p>
+        </w:tc>
+        <w:tc>
+          <w:tcPr/>
+          <w:p>
+            <w:pPr>
+              <w:pStyle w:val="Compact"/>
+              <w:jc w:val="right"/>
+            </w:pPr>
+            <w:r>
+              <w:t xml:space="preserve">19</w:t>
+            </w:r>
+          </w:p>
+        </w:tc>
+        <w:tc>
+          <w:tcPr/>
+          <w:p>
+            <w:pPr>
+              <w:pStyle w:val="Compact"/>
+              <w:jc w:val="right"/>
+            </w:pPr>
+            <w:r>
+              <w:t xml:space="preserve">27</w:t>
+            </w:r>
+          </w:p>
+        </w:tc>
+        <w:tc>
+          <w:tcPr/>
+          <w:p>
+            <w:pPr>
+              <w:pStyle w:val="Compact"/>
+              <w:jc w:val="right"/>
+            </w:pPr>
+            <w:r>
+              <w:t xml:space="preserve">48</w:t>
+            </w:r>
+          </w:p>
+        </w:tc>
+      </w:tr>
+    </w:tbl>
+    <w:p>
+      <w:pPr>
+        <w:pStyle w:val="Compact"/>
         <w:numPr>
           <w:ilvl w:val="0"/>
           <w:numId w:val="1005"/>
         </w:numPr>
       </w:pPr>
       <w:r>
-        <w:t xml:space="preserve">One of the big claims of the potential accuracy of the Literary Digest polls when they originally published their article was that they had surveyed 10 million people and that the results were based on 2.3 million responses! How did it go so wrong even with such a big sample size?</w:t>
+        <w:t xml:space="preserve">What do you notice about the % of people who claimed that they sent the straw vote ballot back?</w:t>
+      </w:r>
+    </w:p>
+    <w:bookmarkEnd w:id="26"/>
+    <w:bookmarkStart w:id="32" w:name="reflection"/>
+    <w:p>
+      <w:pPr>
+        <w:pStyle w:val="Heading2"/>
+      </w:pPr>
+      <w:r>
+        <w:t xml:space="preserve">Reflection</w:t>
       </w:r>
     </w:p>
     <w:p>
       <w:pPr>
         <w:numPr>
           <w:ilvl w:val="0"/>
-          <w:numId w:val="1005"/>
+          <w:numId w:val="1006"/>
+        </w:numPr>
+      </w:pPr>
+      <w:r>
+        <w:t xml:space="preserve">One of the big claims of the potential accuracy of the Literary Digest polls when they originally published their article was that they had surveyed 10 million people and that the results were based on 2.3 million responses! How did it go so wrong even with such a big sample size?</w:t>
+      </w:r>
+    </w:p>
+    <w:p>
+      <w:pPr>
+        <w:numPr>
+          <w:ilvl w:val="0"/>
+          <w:numId w:val="1006"/>
         </w:numPr>
       </w:pPr>
       <w:r>
@@ -1294,6 +1520,91 @@
       </w:pPr>
     </w:lvl>
   </w:abstractNum>
+  <w:abstractNum w:abstractNumId="99418">
+    <w:nsid w:val="00A99418"/>
+    <w:multiLevelType w:val="multilevel"/>
+    <w:lvl w:ilvl="0">
+      <w:start w:val="8"/>
+      <w:numFmt w:val="decimal"/>
+      <w:lvlText w:val="%1."/>
+      <w:lvlJc w:val="left"/>
+      <w:pPr>
+        <w:ind w:left="720" w:hanging="360"/>
+      </w:pPr>
+    </w:lvl>
+    <w:lvl w:ilvl="1">
+      <w:start w:val="8"/>
+      <w:numFmt w:val="decimal"/>
+      <w:lvlText w:val="%2."/>
+      <w:lvlJc w:val="left"/>
+      <w:pPr>
+        <w:ind w:left="1440" w:hanging="360"/>
+      </w:pPr>
+    </w:lvl>
+    <w:lvl w:ilvl="2">
+      <w:start w:val="8"/>
+      <w:numFmt w:val="decimal"/>
+      <w:lvlText w:val="%3."/>
+      <w:lvlJc w:val="left"/>
+      <w:pPr>
+        <w:ind w:left="2160" w:hanging="360"/>
+      </w:pPr>
+    </w:lvl>
+    <w:lvl w:ilvl="3">
+      <w:start w:val="8"/>
+      <w:numFmt w:val="decimal"/>
+      <w:lvlText w:val="%4."/>
+      <w:lvlJc w:val="left"/>
+      <w:pPr>
+        <w:ind w:left="2880" w:hanging="360"/>
+      </w:pPr>
+    </w:lvl>
+    <w:lvl w:ilvl="4">
+      <w:start w:val="8"/>
+      <w:numFmt w:val="decimal"/>
+      <w:lvlText w:val="%5."/>
+      <w:lvlJc w:val="left"/>
+      <w:pPr>
+        <w:ind w:left="3600" w:hanging="360"/>
+      </w:pPr>
+    </w:lvl>
+    <w:lvl w:ilvl="5">
+      <w:start w:val="8"/>
+      <w:numFmt w:val="decimal"/>
+      <w:lvlText w:val="%6."/>
+      <w:lvlJc w:val="left"/>
+      <w:pPr>
+        <w:ind w:left="4320" w:hanging="360"/>
+      </w:pPr>
+    </w:lvl>
+    <w:lvl w:ilvl="6">
+      <w:start w:val="8"/>
+      <w:numFmt w:val="decimal"/>
+      <w:lvlText w:val="%7."/>
+      <w:lvlJc w:val="left"/>
+      <w:pPr>
+        <w:ind w:left="5040" w:hanging="360"/>
+      </w:pPr>
+    </w:lvl>
+    <w:lvl w:ilvl="7">
+      <w:start w:val="8"/>
+      <w:numFmt w:val="decimal"/>
+      <w:lvlText w:val="%8."/>
+      <w:lvlJc w:val="left"/>
+      <w:pPr>
+        <w:ind w:left="5760" w:hanging="360"/>
+      </w:pPr>
+    </w:lvl>
+    <w:lvl w:ilvl="8">
+      <w:start w:val="8"/>
+      <w:numFmt w:val="decimal"/>
+      <w:lvlText w:val="%9."/>
+      <w:lvlJc w:val="left"/>
+      <w:pPr>
+        <w:ind w:left="6480" w:hanging="360"/>
+      </w:pPr>
+    </w:lvl>
+  </w:abstractNum>
   <w:abstractNum w:abstractNumId="99419">
     <w:nsid w:val="00A99419"/>
     <w:multiLevelType w:val="multilevel"/>
@@ -1476,6 +1787,36 @@
     </w:lvlOverride>
   </w:num>
   <w:num w:numId="1005">
+    <w:abstractNumId w:val="99418"/>
+    <w:lvlOverride w:ilvl="0">
+      <w:startOverride w:val="8"/>
+    </w:lvlOverride>
+    <w:lvlOverride w:ilvl="1">
+      <w:startOverride w:val="8"/>
+    </w:lvlOverride>
+    <w:lvlOverride w:ilvl="2">
+      <w:startOverride w:val="8"/>
+    </w:lvlOverride>
+    <w:lvlOverride w:ilvl="3">
+      <w:startOverride w:val="8"/>
+    </w:lvlOverride>
+    <w:lvlOverride w:ilvl="4">
+      <w:startOverride w:val="8"/>
+    </w:lvlOverride>
+    <w:lvlOverride w:ilvl="5">
+      <w:startOverride w:val="8"/>
+    </w:lvlOverride>
+    <w:lvlOverride w:ilvl="6">
+      <w:startOverride w:val="8"/>
+    </w:lvlOverride>
+    <w:lvlOverride w:ilvl="7">
+      <w:startOverride w:val="8"/>
+    </w:lvlOverride>
+    <w:lvlOverride w:ilvl="8">
+      <w:startOverride w:val="8"/>
+    </w:lvlOverride>
+  </w:num>
+  <w:num w:numId="1006">
     <w:abstractNumId w:val="99419"/>
     <w:lvlOverride w:ilvl="0">
       <w:startOverride w:val="9"/>

</xml_diff>